<commit_message>
docs: specify storage folders AI services and configuration lifecycle
</commit_message>
<xml_diff>
--- a/docs/superpowers/plans/C1-网页编辑与确定性导出-实施计划.docx
+++ b/docs/superpowers/plans/C1-网页编辑与确定性导出-实施计划.docx
@@ -2663,6 +2663,11 @@
       </w:r>
     </w:p>
     <w:p>
+      <w:r>
+        <w:t>配置需求补充见 v0.4 配置中心与素材目录 (../../configuration-v0.4/README.md)：C3–C5计划编制时需纳入配置版本、云存储根前缀／用户目录、AI模型与费用、20类配置及对应验收。此补充为待评审方案，未使C1自动包含云端实现。</w:t>
+      </w:r>
+    </w:p>
+    <w:p>
       <w:pPr>
         <w:pStyle w:val="Heading2"/>
       </w:pPr>

</xml_diff>